<commit_message>
refactor: change alarmliste format for printing
</commit_message>
<xml_diff>
--- a/generated/BEISPIEL_ausgabe/Alarmliste.docx
+++ b/generated/BEISPIEL_ausgabe/Alarmliste.docx
@@ -8,12 +8,12 @@
         <w:tblLook w:firstColumn="1" w:firstRow="1" w:lastColumn="0" w:lastRow="0" w:noHBand="0" w:noVBand="1" w:val="04A0"/>
       </w:tblPr>
       <w:tblGrid>
-        <w:gridCol w:w="9972"/>
+        <w:gridCol w:w="9638"/>
       </w:tblGrid>
       <w:tr>
         <w:tc>
           <w:tcPr>
-            <w:tcW w:type="dxa" w:w="9972"/>
+            <w:tcW w:type="dxa" w:w="9638"/>
             <w:shd w:val="clear" w:color="auto" w:fill="C8102E"/>
             <w:vAlign w:val="center"/>
           </w:tcPr>
@@ -77,7 +77,7 @@
                 <w:rFonts w:ascii="Arial" w:hAnsi="Arial"/>
                 <w:sz w:val="22"/>
               </w:rPr>
-              <w:t>Asbestsanierung Küche 3 Zi.Whg. 2.OG</w:t>
+              <w:t>MFH Asbestsanierung Küche 3 Zi.Whg. 2.OG mit langem Beschreibungstext</w:t>
             </w:r>
           </w:p>
         </w:tc>
@@ -366,9 +366,9 @@
         <w:tblLook w:firstColumn="1" w:firstRow="1" w:lastColumn="0" w:lastRow="0" w:noHBand="0" w:noVBand="1" w:val="04A0"/>
       </w:tblPr>
       <w:tblGrid>
-        <w:gridCol w:w="3324"/>
-        <w:gridCol w:w="3324"/>
-        <w:gridCol w:w="3324"/>
+        <w:gridCol w:w="3213"/>
+        <w:gridCol w:w="3213"/>
+        <w:gridCol w:w="3213"/>
       </w:tblGrid>
       <w:tr>
         <w:tc>
@@ -427,7 +427,7 @@
       <w:tr>
         <w:tc>
           <w:tcPr>
-            <w:tcW w:type="dxa" w:w="3324"/>
+            <w:tcW w:type="dxa" w:w="3213"/>
             <w:vMerge/>
           </w:tcPr>
           <w:p/>
@@ -468,7 +468,7 @@
       <w:tr>
         <w:tc>
           <w:tcPr>
-            <w:tcW w:type="dxa" w:w="3324"/>
+            <w:tcW w:type="dxa" w:w="3213"/>
             <w:vMerge/>
           </w:tcPr>
           <w:p/>
@@ -509,7 +509,7 @@
       <w:tr>
         <w:tc>
           <w:tcPr>
-            <w:tcW w:type="dxa" w:w="3324"/>
+            <w:tcW w:type="dxa" w:w="3213"/>
             <w:vMerge/>
           </w:tcPr>
           <w:p/>
@@ -550,7 +550,7 @@
       <w:tr>
         <w:tc>
           <w:tcPr>
-            <w:tcW w:type="dxa" w:w="3324"/>
+            <w:tcW w:type="dxa" w:w="3213"/>
             <w:vMerge/>
           </w:tcPr>
           <w:p/>
@@ -596,9 +596,9 @@
         <w:tblLook w:firstColumn="1" w:firstRow="1" w:lastColumn="0" w:lastRow="0" w:noHBand="0" w:noVBand="1" w:val="04A0"/>
       </w:tblPr>
       <w:tblGrid>
-        <w:gridCol w:w="3324"/>
-        <w:gridCol w:w="3324"/>
-        <w:gridCol w:w="3324"/>
+        <w:gridCol w:w="3213"/>
+        <w:gridCol w:w="3213"/>
+        <w:gridCol w:w="3213"/>
       </w:tblGrid>
       <w:tr>
         <w:tc>
@@ -674,12 +674,12 @@
         <w:tblLook w:firstColumn="1" w:firstRow="1" w:lastColumn="0" w:lastRow="0" w:noHBand="0" w:noVBand="1" w:val="04A0"/>
       </w:tblPr>
       <w:tblGrid>
-        <w:gridCol w:w="9972"/>
+        <w:gridCol w:w="9638"/>
       </w:tblGrid>
       <w:tr>
         <w:tc>
           <w:tcPr>
-            <w:tcW w:type="dxa" w:w="9972"/>
+            <w:tcW w:type="dxa" w:w="9638"/>
             <w:shd w:val="clear" w:color="auto" w:fill="C8102E"/>
           </w:tcPr>
           <w:p>
@@ -708,12 +708,12 @@
         <w:tblLook w:firstColumn="1" w:firstRow="1" w:lastColumn="0" w:lastRow="0" w:noHBand="0" w:noVBand="1" w:val="04A0"/>
       </w:tblPr>
       <w:tblGrid>
-        <w:gridCol w:w="9972"/>
+        <w:gridCol w:w="9638"/>
       </w:tblGrid>
       <w:tr>
         <w:tc>
           <w:tcPr>
-            <w:tcW w:type="dxa" w:w="9972"/>
+            <w:tcW w:type="dxa" w:w="9638"/>
             <w:shd w:val="clear" w:color="auto" w:fill="F5F5F5"/>
           </w:tcPr>
           <w:p>
@@ -752,13 +752,13 @@
         <w:tblLook w:firstColumn="1" w:firstRow="1" w:lastColumn="0" w:lastRow="0" w:noHBand="0" w:noVBand="1" w:val="04A0"/>
       </w:tblPr>
       <w:tblGrid>
-        <w:gridCol w:w="4986"/>
-        <w:gridCol w:w="4986"/>
+        <w:gridCol w:w="4819"/>
+        <w:gridCol w:w="4819"/>
       </w:tblGrid>
       <w:tr>
         <w:tc>
           <w:tcPr>
-            <w:tcW w:type="dxa" w:w="4986"/>
+            <w:tcW w:type="dxa" w:w="4819"/>
             <w:shd w:val="clear" w:color="auto" w:fill="D9D9D9"/>
             <w:vAlign w:val="center"/>
           </w:tcPr>
@@ -777,7 +777,7 @@
         </w:tc>
         <w:tc>
           <w:tcPr>
-            <w:tcW w:type="dxa" w:w="4986"/>
+            <w:tcW w:type="dxa" w:w="4819"/>
             <w:shd w:val="clear" w:color="auto" w:fill="D9D9D9"/>
             <w:vAlign w:val="center"/>
           </w:tcPr>
@@ -798,7 +798,7 @@
       <w:tr>
         <w:tc>
           <w:tcPr>
-            <w:tcW w:type="dxa" w:w="4986"/>
+            <w:tcW w:type="dxa" w:w="4819"/>
             <w:vAlign w:val="center"/>
           </w:tcPr>
           <w:p>
@@ -814,7 +814,7 @@
         </w:tc>
         <w:tc>
           <w:tcPr>
-            <w:tcW w:type="dxa" w:w="4986"/>
+            <w:tcW w:type="dxa" w:w="4819"/>
             <w:vAlign w:val="center"/>
           </w:tcPr>
           <w:p>
@@ -832,7 +832,7 @@
       <w:tr>
         <w:tc>
           <w:tcPr>
-            <w:tcW w:type="dxa" w:w="4986"/>
+            <w:tcW w:type="dxa" w:w="4819"/>
             <w:vAlign w:val="center"/>
           </w:tcPr>
           <w:p>
@@ -857,7 +857,7 @@
         </w:tc>
         <w:tc>
           <w:tcPr>
-            <w:tcW w:type="dxa" w:w="4986"/>
+            <w:tcW w:type="dxa" w:w="4819"/>
             <w:vAlign w:val="center"/>
           </w:tcPr>
           <w:p>
@@ -874,7 +874,7 @@
       </w:tr>
     </w:tbl>
     <w:sectPr>
-      <w:pgSz w:w="12240" w:h="15840"/>
+      <w:pgSz w:w="11906" w:h="16838"/>
       <w:pgMar w:top="850" w:right="1134" w:bottom="850" w:left="1134" w:header="720" w:footer="720" w:gutter="0"/>
       <w:cols w:space="720"/>
       <w:docGrid w:linePitch="360"/>

</xml_diff>